<commit_message>
Update documentation and system design document
</commit_message>
<xml_diff>
--- a/docs/PocketBooks_System Design Document Template.docx
+++ b/docs/PocketBooks_System Design Document Template.docx
@@ -216,33 +216,65 @@
           <w:sz w:val="32"/>
           <w:szCs w:val="32"/>
         </w:rPr>
-        <w:t>Version: 0.1</w:t>
-      </w:r>
-    </w:p>
-    <w:p>
-      <w:pPr>
+        <w:t xml:space="preserve">Version: </w:t>
+      </w:r>
+      <w:r>
         <w:rPr>
           <w:rFonts w:ascii="Play" w:eastAsia="Play" w:hAnsi="Play" w:cs="Play"/>
           <w:sz w:val="32"/>
           <w:szCs w:val="32"/>
         </w:rPr>
-      </w:pPr>
-      <w:r>
+        <w:t>1</w:t>
+      </w:r>
+    </w:p>
+    <w:p>
+      <w:pPr>
         <w:rPr>
           <w:rFonts w:ascii="Play" w:eastAsia="Play" w:hAnsi="Play" w:cs="Play"/>
           <w:sz w:val="32"/>
           <w:szCs w:val="32"/>
         </w:rPr>
-        <w:t>Date: 2/18/2026</w:t>
-      </w:r>
+      </w:pPr>
       <w:r>
         <w:rPr>
           <w:rFonts w:ascii="Play" w:eastAsia="Play" w:hAnsi="Play" w:cs="Play"/>
           <w:sz w:val="32"/>
           <w:szCs w:val="32"/>
         </w:rPr>
+        <w:t xml:space="preserve">Date: </w:t>
+      </w:r>
+      <w:r>
+        <w:rPr>
+          <w:rFonts w:ascii="Play" w:eastAsia="Play" w:hAnsi="Play" w:cs="Play"/>
+          <w:sz w:val="32"/>
+          <w:szCs w:val="32"/>
+        </w:rPr>
+        <w:t>5/27</w:t>
+      </w:r>
+      <w:r>
+        <w:rPr>
+          <w:rFonts w:ascii="Play" w:eastAsia="Play" w:hAnsi="Play" w:cs="Play"/>
+          <w:sz w:val="32"/>
+          <w:szCs w:val="32"/>
+        </w:rPr>
+        <w:t>/2026</w:t>
+      </w:r>
+      <w:r>
+        <w:rPr>
+          <w:rFonts w:ascii="Play" w:eastAsia="Play" w:hAnsi="Play" w:cs="Play"/>
+          <w:sz w:val="32"/>
+          <w:szCs w:val="32"/>
+        </w:rPr>
         <w:br/>
-        <w:t>Status: In Progress</w:t>
+        <w:t xml:space="preserve">Status: </w:t>
+      </w:r>
+      <w:r>
+        <w:rPr>
+          <w:rFonts w:ascii="Play" w:eastAsia="Play" w:hAnsi="Play" w:cs="Play"/>
+          <w:sz w:val="32"/>
+          <w:szCs w:val="32"/>
+        </w:rPr>
+        <w:t>DONE</w:t>
       </w:r>
     </w:p>
     <w:p>
@@ -685,7 +717,7 @@
                 <w:rFonts w:ascii="Play" w:eastAsia="Play" w:hAnsi="Play" w:cs="Play"/>
                 <w:color w:val="0F1115"/>
               </w:rPr>
-              <w:t>[Date]</w:t>
+              <w:t>3/20/2026</w:t>
             </w:r>
           </w:p>
         </w:tc>
@@ -714,7 +746,7 @@
                 <w:rFonts w:ascii="Play" w:eastAsia="Play" w:hAnsi="Play" w:cs="Play"/>
                 <w:color w:val="0F1115"/>
               </w:rPr>
-              <w:t>[Your Name]</w:t>
+              <w:t>Jascha B. Base</w:t>
             </w:r>
           </w:p>
         </w:tc>
@@ -835,7 +867,7 @@
                 <w:rFonts w:ascii="Play" w:eastAsia="Play" w:hAnsi="Play" w:cs="Play"/>
                 <w:color w:val="0F1115"/>
               </w:rPr>
-              <w:t>[Date]</w:t>
+              <w:t>3/31/2026</w:t>
             </w:r>
           </w:p>
         </w:tc>
@@ -864,7 +896,7 @@
                 <w:rFonts w:ascii="Play" w:eastAsia="Play" w:hAnsi="Play" w:cs="Play"/>
                 <w:color w:val="0F1115"/>
               </w:rPr>
-              <w:t>[Your Name]</w:t>
+              <w:t>Jascha B. Base</w:t>
             </w:r>
           </w:p>
         </w:tc>
@@ -985,7 +1017,7 @@
                 <w:rFonts w:ascii="Play" w:eastAsia="Play" w:hAnsi="Play" w:cs="Play"/>
                 <w:color w:val="0F1115"/>
               </w:rPr>
-              <w:t>[Date]</w:t>
+              <w:t>4/02/2026</w:t>
             </w:r>
           </w:p>
         </w:tc>
@@ -1014,7 +1046,7 @@
                 <w:rFonts w:ascii="Play" w:eastAsia="Play" w:hAnsi="Play" w:cs="Play"/>
                 <w:color w:val="0F1115"/>
               </w:rPr>
-              <w:t>[Your Name]</w:t>
+              <w:t>Jascha B. Base</w:t>
             </w:r>
           </w:p>
         </w:tc>
@@ -1135,7 +1167,7 @@
                 <w:rFonts w:ascii="Play" w:eastAsia="Play" w:hAnsi="Play" w:cs="Play"/>
                 <w:color w:val="0F1115"/>
               </w:rPr>
-              <w:t>[Date]</w:t>
+              <w:t>4/05/2026</w:t>
             </w:r>
           </w:p>
         </w:tc>
@@ -1164,7 +1196,7 @@
                 <w:rFonts w:ascii="Play" w:eastAsia="Play" w:hAnsi="Play" w:cs="Play"/>
                 <w:color w:val="0F1115"/>
               </w:rPr>
-              <w:t>[Your Name]</w:t>
+              <w:t>Jascha B. Base</w:t>
             </w:r>
           </w:p>
         </w:tc>
@@ -1285,7 +1317,7 @@
                 <w:rFonts w:ascii="Play" w:eastAsia="Play" w:hAnsi="Play" w:cs="Play"/>
                 <w:color w:val="0F1115"/>
               </w:rPr>
-              <w:t>[Date]</w:t>
+              <w:t>4/27/2026</w:t>
             </w:r>
           </w:p>
         </w:tc>
@@ -1314,7 +1346,7 @@
                 <w:rFonts w:ascii="Play" w:eastAsia="Play" w:hAnsi="Play" w:cs="Play"/>
                 <w:color w:val="0F1115"/>
               </w:rPr>
-              <w:t>[Your Name]</w:t>
+              <w:t>Jascha B. Base</w:t>
             </w:r>
           </w:p>
         </w:tc>
@@ -1435,7 +1467,7 @@
                 <w:rFonts w:ascii="Play" w:eastAsia="Play" w:hAnsi="Play" w:cs="Play"/>
                 <w:color w:val="0F1115"/>
               </w:rPr>
-              <w:t>[Date]</w:t>
+              <w:t>5/25/2026</w:t>
             </w:r>
           </w:p>
         </w:tc>
@@ -1464,7 +1496,7 @@
                 <w:rFonts w:ascii="Play" w:eastAsia="Play" w:hAnsi="Play" w:cs="Play"/>
                 <w:color w:val="0F1115"/>
               </w:rPr>
-              <w:t>[Your Name]</w:t>
+              <w:t>Jascha B. Base</w:t>
             </w:r>
           </w:p>
         </w:tc>

</xml_diff>

<commit_message>
Update PocketBooks System Design Document
</commit_message>
<xml_diff>
--- a/docs/PocketBooks_System Design Document Template.docx
+++ b/docs/PocketBooks_System Design Document Template.docx
@@ -81,7 +81,23 @@
           <w:sz w:val="72"/>
           <w:szCs w:val="72"/>
         </w:rPr>
-        <w:t>IT342-[Section]</w:t>
+        <w:t>IT342-[</w:t>
+      </w:r>
+      <w:r>
+        <w:rPr>
+          <w:rFonts w:ascii="Play" w:eastAsia="Play" w:hAnsi="Play" w:cs="Play"/>
+          <w:sz w:val="72"/>
+          <w:szCs w:val="72"/>
+        </w:rPr>
+        <w:t>G4</w:t>
+      </w:r>
+      <w:r>
+        <w:rPr>
+          <w:rFonts w:ascii="Play" w:eastAsia="Play" w:hAnsi="Play" w:cs="Play"/>
+          <w:sz w:val="72"/>
+          <w:szCs w:val="72"/>
+        </w:rPr>
+        <w:t>]</w:t>
       </w:r>
     </w:p>
     <w:p>
@@ -134,7 +150,27 @@
           <w:sz w:val="56"/>
           <w:szCs w:val="56"/>
         </w:rPr>
-        <w:t>System Design Document (SDD)</w:t>
+        <w:t>System Design Document (</w:t>
+      </w:r>
+      <w:r>
+        <w:rPr>
+          <w:rFonts w:ascii="Play" w:eastAsia="Play" w:hAnsi="Play" w:cs="Play"/>
+          <w:b/>
+          <w:bCs/>
+          <w:sz w:val="56"/>
+          <w:szCs w:val="56"/>
+        </w:rPr>
+        <w:t>G4</w:t>
+      </w:r>
+      <w:r>
+        <w:rPr>
+          <w:rFonts w:ascii="Play" w:eastAsia="Play" w:hAnsi="Play" w:cs="Play"/>
+          <w:b/>
+          <w:bCs/>
+          <w:sz w:val="56"/>
+          <w:szCs w:val="56"/>
+        </w:rPr>
+        <w:t>)</w:t>
       </w:r>
     </w:p>
     <w:p>

</xml_diff>